<commit_message>
docs: update QA report with MERN stack verification
</commit_message>
<xml_diff>
--- a/Orbita_Testing_and_Debugging_Report.docx
+++ b/Orbita_Testing_and_Debugging_Report.docx
@@ -17,7 +17,7 @@
           <w:color w:val="64748B"/>
           <w:sz w:val="28"/>
         </w:rPr>
-        <w:t>4 Simplified Core Types Architecture &amp; QA Verification Report</w:t>
+        <w:t>MERN Stack Architecture &amp; QA Verification Report</w:t>
       </w:r>
     </w:p>
     <w:p>
@@ -30,7 +30,7 @@
     </w:p>
     <w:p>
       <w:r>
-        <w:t>In strict alignment with the Simplifications sheet in the Orbita Project BRD, the entire system has been streamlined into 4 core types: Task, Routine, Goal, and Project. Each type operates with Personal and Work workspaces, automatic Eisenhower Priority Quadrant assignment (Q1 to Q4), and dedicated life cycle execution rules.</w:t>
+        <w:t>Orbita is a modern MERN stack work management platform powered by MongoDB Atlas, Express, React (Vite), and Node.js. It operates with a streamlined 4-type universal architecture: Tasks, Routines, Goals, and Projects, featuring stage-task level focus timers, live real-time stopwatches, Eisenhower Matrix integration, one-click CSV/JSON data dump exports, and Git version control.</w:t>
       </w:r>
     </w:p>
     <w:p>
@@ -38,7 +38,7 @@
         <w:pStyle w:val="Heading1"/>
       </w:pPr>
       <w:r>
-        <w:t>2. The 4 Simplified Orbita Types</w:t>
+        <w:t>2. The 4 Core Orbita Types</w:t>
       </w:r>
     </w:p>
     <w:tbl>
@@ -338,7 +338,7 @@
           </w:tcPr>
           <w:p>
             <w:r>
-              <w:t>Yes</w:t>
+              <w:t>Yes (Task-Level)</w:t>
             </w:r>
           </w:p>
         </w:tc>
@@ -465,7 +465,7 @@
           </w:tcPr>
           <w:p>
             <w:r>
-              <w:t>4 Core Orbita Types</w:t>
+              <w:t>Database Engine</w:t>
             </w:r>
           </w:p>
         </w:tc>
@@ -475,7 +475,7 @@
           </w:tcPr>
           <w:p>
             <w:r>
-              <w:t>Tasks, Routines, Goals, Projects Architecture</w:t>
+              <w:t>MongoDB Atlas Cloud Integration</w:t>
             </w:r>
           </w:p>
         </w:tc>
@@ -495,7 +495,7 @@
           </w:tcPr>
           <w:p>
             <w:r>
-              <w:t>Recreated schema and UI for the 4 pure types</w:t>
+              <w:t>Mongoose models with auto-reconnect, secure Atlas cluster connection</w:t>
             </w:r>
           </w:p>
         </w:tc>
@@ -507,7 +507,7 @@
           </w:tcPr>
           <w:p>
             <w:r>
-              <w:t>Workspace Division</w:t>
+              <w:t>Project Stage-Tasks</w:t>
             </w:r>
           </w:p>
         </w:tc>
@@ -517,7 +517,7 @@
           </w:tcPr>
           <w:p>
             <w:r>
-              <w:t>Personal vs Work 2-Way Filtering</w:t>
+              <w:t>Task-Level Timer &amp; Matrix Visibility</w:t>
             </w:r>
           </w:p>
         </w:tc>
@@ -537,7 +537,7 @@
           </w:tcPr>
           <w:p>
             <w:r>
-              <w:t>Seamless toggle between Personal, Work, and All items</w:t>
+              <w:t>Individual stage tasks appear in Matrix and have their own focus timers</w:t>
             </w:r>
           </w:p>
         </w:tc>
@@ -549,7 +549,7 @@
           </w:tcPr>
           <w:p>
             <w:r>
-              <w:t>Project Hierarchy</w:t>
+              <w:t>Projects View UI</w:t>
             </w:r>
           </w:p>
         </w:tc>
@@ -559,7 +559,7 @@
           </w:tcPr>
           <w:p>
             <w:r>
-              <w:t>Stage -&gt; Task Multistep Delivery</w:t>
+              <w:t>Collapse/Expand Stages Controller</w:t>
             </w:r>
           </w:p>
         </w:tc>
@@ -579,7 +579,7 @@
           </w:tcPr>
           <w:p>
             <w:r>
-              <w:t>Stage-tasks progress bars; project auto-completes only when all tasks are done</w:t>
+              <w:t>Interactive expand/collapse toggle; project completion shown as status badge</w:t>
             </w:r>
           </w:p>
         </w:tc>
@@ -591,7 +591,7 @@
           </w:tcPr>
           <w:p>
             <w:r>
-              <w:t>Goal Focus Tracking</w:t>
+              <w:t>Data Dump Export</w:t>
             </w:r>
           </w:p>
         </w:tc>
@@ -601,7 +601,7 @@
           </w:tcPr>
           <w:p>
             <w:r>
-              <w:t>Live Stopwatch Timer &amp; Hours Target</w:t>
+              <w:t>One-Click CSV &amp; JSON Export</w:t>
             </w:r>
           </w:p>
         </w:tc>
@@ -621,7 +621,7 @@
           </w:tcPr>
           <w:p>
             <w:r>
-              <w:t>Live real-time ticking stopwatch badge, effort target progress, and timesheets</w:t>
+              <w:t>Instant CSV and JSON download in Data Grid, Timesheets, and Audit Logs</w:t>
             </w:r>
           </w:p>
         </w:tc>
@@ -633,7 +633,7 @@
           </w:tcPr>
           <w:p>
             <w:r>
-              <w:t>Routine Recurrence</w:t>
+              <w:t>Priority Derivation</w:t>
             </w:r>
           </w:p>
         </w:tc>
@@ -643,7 +643,7 @@
           </w:tcPr>
           <w:p>
             <w:r>
-              <w:t>Automated Recurrence Patterns</w:t>
+              <w:t>Unified Quadrant &amp; Priority</w:t>
             </w:r>
           </w:p>
         </w:tc>
@@ -663,7 +663,7 @@
           </w:tcPr>
           <w:p>
             <w:r>
-              <w:t>Daily, Weekly, Monthly, and Yearly recurrence schedules</w:t>
+              <w:t>Priority is automatically calculated from Importance &amp; Urgency checkboxes</w:t>
             </w:r>
           </w:p>
         </w:tc>
@@ -675,7 +675,7 @@
           </w:tcPr>
           <w:p>
             <w:r>
-              <w:t>Clean State Reset</w:t>
+              <w:t>Calendar Planner</w:t>
             </w:r>
           </w:p>
         </w:tc>
@@ -685,7 +685,7 @@
           </w:tcPr>
           <w:p>
             <w:r>
-              <w:t>Wipe Database to 0 Users / 0 Items</w:t>
+              <w:t>7-Column Responsive Grid View</w:t>
             </w:r>
           </w:p>
         </w:tc>
@@ -705,7 +705,7 @@
           </w:tcPr>
           <w:p>
             <w:r>
-              <w:t>Pure blank slate ready for fresh user registration and login</w:t>
+              <w:t>Modern calendar grid layout with today badge and click-to-schedule pills</w:t>
             </w:r>
           </w:p>
         </w:tc>
@@ -717,7 +717,7 @@
           </w:tcPr>
           <w:p>
             <w:r>
-              <w:t>Eisenhower Matrix</w:t>
+              <w:t>Git Deployment</w:t>
             </w:r>
           </w:p>
         </w:tc>
@@ -727,7 +727,7 @@
           </w:tcPr>
           <w:p>
             <w:r>
-              <w:t>2x2 Decision Grid (Q1 to Q4)</w:t>
+              <w:t>GitHub Repository Sync</w:t>
             </w:r>
           </w:p>
         </w:tc>
@@ -747,49 +747,7 @@
           </w:tcPr>
           <w:p>
             <w:r>
-              <w:t>Automatic assignment into Q1: Do Now, Q2: Plan, Q3: Quick Action, Q4: Optional</w:t>
-            </w:r>
-          </w:p>
-        </w:tc>
-      </w:tr>
-      <w:tr>
-        <w:tc>
-          <w:tcPr>
-            <w:tcW w:type="dxa" w:w="2340"/>
-          </w:tcPr>
-          <w:p>
-            <w:r>
-              <w:t>Monthly Highlights</w:t>
-            </w:r>
-          </w:p>
-        </w:tc>
-        <w:tc>
-          <w:tcPr>
-            <w:tcW w:type="dxa" w:w="2340"/>
-          </w:tcPr>
-          <w:p>
-            <w:r>
-              <w:t>Scorecard &amp; Starred Milestones</w:t>
-            </w:r>
-          </w:p>
-        </w:tc>
-        <w:tc>
-          <w:tcPr>
-            <w:tcW w:type="dxa" w:w="2340"/>
-          </w:tcPr>
-          <w:p>
-            <w:r>
-              <w:t>PASSED</w:t>
-            </w:r>
-          </w:p>
-        </w:tc>
-        <w:tc>
-          <w:tcPr>
-            <w:tcW w:type="dxa" w:w="2340"/>
-          </w:tcPr>
-          <w:p>
-            <w:r>
-              <w:t>Monthly productivity recognition, achievement badges, and milestone showcase</w:t>
+              <w:t>Pushed cleanly to https://github.com/code-with-varun/orbita.git (ignoring .env)</w:t>
             </w:r>
           </w:p>
         </w:tc>

</xml_diff>